<commit_message>
feat: first TDD seam; TaskAcceptanceEvaluator per EffectEvidence and EffectObligation (task acceptance kernel)
feat:

docs: close grilling sessision within docs, update plans and dev log
</commit_message>
<xml_diff>
--- a/docs/artifacts/design-reports/uah_environment_ingress_task_closure_design_report.docx
+++ b/docs/artifacts/design-reports/uah_environment_ingress_task_closure_design_report.docx
@@ -216,7 +216,7 @@
             <w:r>
               <w:t>Prepared by UAH project</w:t>
               <w:br/>
-              <w:t>8 September 2026</w:t>
+              <w:t>9 September 2026</w:t>
             </w:r>
           </w:p>
         </w:tc>
@@ -326,9 +326,7 @@
           <w:szCs w:val="48"/>
         </w:rPr>
       </w:pPr>
-      <w:r>
-        <w:t>Executive summary  ·  Architecture checkpoint  ·  Key findings  ·  Implications  ·  Recommendations  ·  Appendix</w:t>
-      </w:r>
+      <w:r/>
     </w:p>
     <w:sdt>
       <w:sdtPr>
@@ -460,7 +458,7 @@
                 <w:vertAlign w:val="baseline"/>
                 <w:rtl w:val="0"/>
               </w:rPr>
-              <w:t xml:space="preserve">Introduction</w:t>
+              <w:t xml:space="preserve">Architecture checkpoint</w:t>
               <w:tab/>
               <w:t xml:space="preserve">2</w:t>
             </w:r>
@@ -799,7 +797,7 @@
                 <w:vertAlign w:val="baseline"/>
                 <w:rtl w:val="0"/>
               </w:rPr>
-              <w:t xml:space="preserve">Notes</w:t>
+              <w:t xml:space="preserve">Identity and authority map</w:t>
               <w:tab/>
               <w:t xml:space="preserve">5</w:t>
             </w:r>
@@ -841,7 +839,7 @@
                 <w:vertAlign w:val="baseline"/>
                 <w:rtl w:val="0"/>
               </w:rPr>
-              <w:t xml:space="preserve">Source placeholders</w:t>
+              <w:t xml:space="preserve">Evidence sources</w:t>
               <w:tab/>
               <w:t xml:space="preserve">5</w:t>
             </w:r>
@@ -1428,7 +1426,7 @@
         <w:rPr/>
       </w:pPr>
       <w:r>
-        <w:t>Confirm the first TDD seam. The recommended starting boundary is TaskAcceptanceEvaluator.evaluate(effect_obligations, evidence_set) -&gt; TaskAcceptance.</w:t>
+        <w:t>Retain the implemented TaskAcceptanceEvaluator.evaluate(effect_obligations, evidence_set) -&gt; TaskAcceptance boundary and compile obligations only from frozen task and domain contracts.</w:t>
       </w:r>
     </w:p>
     <w:p>
@@ -1455,7 +1453,7 @@
         <w:rPr/>
       </w:pPr>
       <w:r>
-        <w:t>Register one synthetic EnvironmentRun, classify one ingress, attach one standby-capable agent run, and connect the existing typed proposal and fake-owner path.</w:t>
+        <w:t>Register one synthetic EnvironmentRun, classify one ingress, attach one standby-capable agent run, and connect the existing typed proposal, fake-owner, and acceptance path.</w:t>
       </w:r>
     </w:p>
     <w:p>
@@ -1501,15 +1499,15 @@
         <w:rPr/>
       </w:pPr>
       <w:r>
-        <w:t>The architecture is ready to leave the grill once the first public test seam is confirmed. It supports continuous environment-bound agents without permanent model allocation, preserves domain authority, and creates a trace grammar suitable for O1/O2 debugging and later Workbench memory.</w:t>
-      </w:r>
-    </w:p>
-    <w:p>
-      <w:pPr>
-        <w:rPr/>
-      </w:pPr>
-      <w:r>
-        <w:t>No environment-run registry, ingress classifier, obligation evaluator, multi-actor ledger, report_result adapter, or dynamic allocator is implemented at this checkpoint. The current release remains an H0 contract proof with one partial H1 vertical slice.</w:t>
+        <w:t>The architecture grill is closed and the first public task-acceptance seam is implemented. The design supports continuous environment-bound agents without permanent model allocation, preserves domain authority, and creates a trace grammar suitable for O1/O2 debugging and later Workbench memory.</w:t>
+      </w:r>
+    </w:p>
+    <w:p>
+      <w:pPr>
+        <w:rPr/>
+      </w:pPr>
+      <w:r>
+        <w:t>No TaskSpec obligation compiler, environment-run registry, ingress classifier, multi-actor ledger, report_result adapter, or dynamic allocator is implemented at this checkpoint. The current release remains an H0 contract proof with partial H1 vertical slices.</w:t>
       </w:r>
     </w:p>
     <w:bookmarkStart w:colFirst="0" w:colLast="0" w:name="bookmark=id.cf45595vup8a" w:id="8"/>
@@ -1586,7 +1584,7 @@
         <w:rPr/>
       </w:pPr>
       <w:r>
-        <w:t>Universal Agentic Harness foundation, canonical Markdown, 8 September 2026.</w:t>
+        <w:t>Universal Agentic Harness foundation, canonical Markdown, 9 September 2026.</w:t>
       </w:r>
     </w:p>
     <w:p>
@@ -1613,7 +1611,7 @@
         <w:rPr/>
       </w:pPr>
       <w:r>
-        <w:t>Universal Agentic Harness masterplan and development log, canonical Markdown, 8 September 2026.</w:t>
+        <w:t>Universal Agentic Harness masterplan and development log, canonical Markdown, 9 September 2026.</w:t>
       </w:r>
     </w:p>
     <w:p>
@@ -1727,7 +1725,7 @@
         </w:rPr>
       </w:pPr>
       <w:r>
-        <w:t>Report status. Architecture and test seams are specified. Runtime implementation and H2 qualification remain open.</w:t>
+        <w:t>Report status. The architecture grill is closed and the task-acceptance seam is implemented. Environment lifecycle, replay, and H2 qualification remain open.</w:t>
       </w:r>
     </w:p>
     <w:sectPr>
@@ -1993,7 +1991,7 @@
                   <w:szCs w:val="17"/>
                   <w:rtl w:val="0"/>
                 </w:rPr>
-                <w:t xml:space="preserve">8 September 2026</w:t>
+                <w:t xml:space="preserve">9 September 2026</w:t>
               </w:r>
             </w:p>
           </w:tc>

</xml_diff>

<commit_message>
docs: update dev and foundation log with env run seams
docs: update deslop distinction for ab_harness_nao
</commit_message>
<xml_diff>
--- a/docs/artifacts/design-reports/uah_environment_ingress_task_closure_design_report.docx
+++ b/docs/artifacts/design-reports/uah_environment_ingress_task_closure_design_report.docx
@@ -918,7 +918,7 @@
         <w:rPr/>
       </w:pPr>
       <w:r>
-        <w:t>H0 freezes identity, environment, ingress, operation-edge, obligation, acceptance, and trace contracts. It does not introduce a scheduler.</w:t>
+        <w:t>H0 freezes identity, environment, operation, acceptance, and trace contracts. It adds no scheduler.</w:t>
       </w:r>
     </w:p>
     <w:p>
@@ -945,7 +945,7 @@
         <w:rPr/>
       </w:pPr>
       <w:r>
-        <w:t>H1 implements registries, deterministic ingress, attached agent-run standby, fixed-instance leases, PromptCompiler, admission, replay, O1, and VerifiedTraceDigest.</w:t>
+        <w:t>H1 adds lifecycle registries, ingress, standby, fixed leases, PromptCompiler, admission, replay, O1, and VerifiedTraceDigest.</w:t>
       </w:r>
     </w:p>
     <w:p>
@@ -972,7 +972,7 @@
         <w:rPr/>
       </w:pPr>
       <w:r>
-        <w:t>H2 remains the first NAO demonstration. It uses fixed chatbot and planner handles, preserves NAO lifecycle owners, and validates report_result as an AB1 operation with explicit chatbot delegation.</w:t>
+        <w:t>H2 is the first NAO demonstration: fixed chatbot and planner handles, native lifecycle ownership, and report_result as AB1 with explicit chatbot delegation.</w:t>
       </w:r>
     </w:p>
     <w:bookmarkStart w:colFirst="0" w:colLast="0" w:name="bookmark=id.4t4jj91ycfx" w:id="3"/>
@@ -980,6 +980,8 @@
     <w:p>
       <w:pPr>
         <w:pStyle w:val="Heading2"/>
+        <w:keepNext/>
+        <w:spacing w:before="360"/>
         <w:rPr/>
       </w:pPr>
       <w:r>
@@ -1019,7 +1021,7 @@
         <w:rPr/>
       </w:pPr>
       <w:r>
-        <w:t>The accepted design preserves the portable-kernel boundary. Core contracts contain no ROS, NAO, provider-SDK, or runtime-product imports. DomainContractPack carries frame-relative objects, role projections, bindings, environment profiles, evidence rules, prompt policy, and qualification cases. Custom adapters are limited to irreducible native normalization.</w:t>
+        <w:t>The accepted design preserves the portable-kernel boundary. Core contracts contain no ROS, NAO, provider-SDK, or runtime-product imports. NAO compatibility and recorded qualification now reside in the separate ab_harness_nao package, with a regression test enforcing dependency direction. DomainContractPack carries frame-relative objects, role projections, bindings, environment profiles, evidence rules, prompt policy, and qualification cases. Custom adapters are limited to irreducible native normalization.</w:t>
       </w:r>
     </w:p>
     <w:p>
@@ -1453,7 +1455,7 @@
         <w:rPr/>
       </w:pPr>
       <w:r>
-        <w:t>Register one synthetic EnvironmentRun, classify one ingress, attach one standby-capable agent run, and connect the existing typed proposal, fake-owner, and acceptance path.</w:t>
+        <w:t>Retain profile-verified EnvironmentRun registration, then classify one immutable ingress, attach one standby-capable agent run, and connect the existing typed proposal, fake-owner, and acceptance path.</w:t>
       </w:r>
     </w:p>
     <w:p>
@@ -1499,15 +1501,15 @@
         <w:rPr/>
       </w:pPr>
       <w:r>
-        <w:t>The architecture grill is closed and the first public task-acceptance seam is implemented. The design supports continuous environment-bound agents without permanent model allocation, preserves domain authority, and creates a trace grammar suitable for O1/O2 debugging and later Workbench memory.</w:t>
-      </w:r>
-    </w:p>
-    <w:p>
-      <w:pPr>
-        <w:rPr/>
-      </w:pPr>
-      <w:r>
-        <w:t>No TaskSpec obligation compiler, environment-run registry, ingress classifier, multi-actor ledger, report_result adapter, or dynamic allocator is implemented at this checkpoint. The current release remains an H0 contract proof with partial H1 vertical slices.</w:t>
+        <w:t>The architecture grill is closed. The public task-acceptance and profile-verified EnvironmentRun registration seams are implemented. The design supports continuous environment-bound agents without permanent model allocation, preserves domain authority, and creates a trace grammar suitable for O1/O2 debugging and later Workbench memory.</w:t>
+      </w:r>
+    </w:p>
+    <w:p>
+      <w:pPr>
+        <w:rPr/>
+      </w:pPr>
+      <w:r>
+        <w:t>Environment profiles and run attestations are immutable in-memory contracts without persistence or signature verification. No TaskSpec obligation compiler, ingress classifier, multi-actor ledger, report_result adapter, or dynamic allocator is implemented at this checkpoint. The current release remains an H0 contract proof with partial H1 vertical slices.</w:t>
       </w:r>
     </w:p>
     <w:bookmarkStart w:colFirst="0" w:colLast="0" w:name="bookmark=id.cf45595vup8a" w:id="8"/>
@@ -1725,7 +1727,7 @@
         </w:rPr>
       </w:pPr>
       <w:r>
-        <w:t>Report status. The architecture grill is closed and the task-acceptance seam is implemented. Environment lifecycle, replay, and H2 qualification remain open.</w:t>
+        <w:t>Report status. The architecture grill is closed. Task acceptance and profile-verified environment registration are implemented. Ingress, lifecycle replay, and H2 qualification remain open.</w:t>
       </w:r>
     </w:p>
     <w:sectPr>

</xml_diff>